<commit_message>
chore(templates): update contract templates and forms
Routine refresh of contract template and external-form artifacts and catalog metadata. Contributions are welcome — open an issue or pull request and we'll fold it in.
</commit_message>
<xml_diff>
--- a/templates/common-paper-cc-by-4.0/common-paper-independent-contractor-agreement/template.docx
+++ b/templates/common-paper-cc-by-4.0/common-paper-independent-contractor-agreement/template.docx
@@ -596,38 +596,6 @@
         </w:rPr>
         <w:t xml:space="preserve">Send to your counterparty for review and signature.</w:t>
       </w:r>
-      <w:r>
-        <w:rPr>
-          <w:rtl w:val="0"/>
-        </w:rPr>
-      </w:r>
-    </w:p>
-    <w:p>
-      <w:pPr>
-        <w:tabs>
-          <w:tab w:val="left" w:leader="none" w:pos="360"/>
-          <w:tab w:val="left" w:leader="none" w:pos="720"/>
-          <w:tab w:val="left" w:leader="none" w:pos="1080"/>
-          <w:tab w:val="left" w:leader="none" w:pos="1440"/>
-        </w:tabs>
-        <w:spacing w:after="120" w:lineRule="auto"/>
-        <w:rPr>
-          <w:rFonts w:ascii="Georgia" w:cs="Georgia" w:eastAsia="Georgia" w:hAnsi="Georgia"/>
-          <w:color w:val="1d2021"/>
-          <w:sz w:val="44"/>
-          <w:szCs w:val="44"/>
-        </w:rPr>
-        <w:sectPr>
-          <w:headerReference r:id="rId6" w:type="default"/>
-          <w:headerReference r:id="rId7" w:type="first"/>
-          <w:footerReference r:id="rId8" w:type="default"/>
-          <w:footerReference r:id="rId9" w:type="first"/>
-          <w:pgSz w:h="15840" w:w="12240" w:orient="portrait"/>
-          <w:pgMar w:bottom="720" w:top="936" w:left="1080" w:right="1080" w:header="360" w:footer="432"/>
-          <w:pgNumType w:start="1"/>
-          <w:titlePg w:val="1"/>
-        </w:sectPr>
-      </w:pPr>
       <w:r>
         <w:rPr>
           <w:rtl w:val="0"/>
@@ -2530,6 +2498,8 @@
           <w:color w:val="000000"/>
         </w:rPr>
         <w:sectPr>
+          <w:headerReference r:id="rId6" w:type="default"/>
+          <w:footerReference r:id="rId8" w:type="default"/>
           <w:type w:val="nextPage"/>
           <w:pgSz w:h="15840" w:w="12240" w:orient="portrait"/>
           <w:pgMar w:bottom="720" w:top="936" w:left="1080" w:right="1080" w:header="360" w:footer="432"/>
@@ -5664,54 +5634,6 @@
         <w:color w:val="107087"/>
         <w:sz w:val="18"/>
         <w:szCs w:val="18"/>
-      </w:rPr>
-      <w:drawing>
-        <wp:anchor allowOverlap="1" behindDoc="0" distB="0" distT="0" distL="0" distR="0" hidden="0" layoutInCell="1" locked="0" relativeHeight="0" simplePos="0">
-          <wp:simplePos x="0" y="0"/>
-          <wp:positionH relativeFrom="page">
-            <wp:posOffset>0</wp:posOffset>
-          </wp:positionH>
-          <wp:positionV relativeFrom="page">
-            <wp:posOffset>0</wp:posOffset>
-          </wp:positionV>
-          <wp:extent cx="7900416" cy="137160"/>
-          <wp:effectExtent b="0" l="0" r="0" t="0"/>
-          <wp:wrapSquare wrapText="bothSides" distB="0" distT="0" distL="0" distR="0"/>
-          <wp:docPr id="2" name="image2.png"/>
-          <a:graphic>
-            <a:graphicData uri="http://schemas.openxmlformats.org/drawingml/2006/picture">
-              <pic:pic>
-                <pic:nvPicPr>
-                  <pic:cNvPr id="0" name="image2.png"/>
-                  <pic:cNvPicPr preferRelativeResize="0"/>
-                </pic:nvPicPr>
-                <pic:blipFill>
-                  <a:blip r:embed="rId1"/>
-                  <a:srcRect b="46571" l="0" r="0" t="0"/>
-                  <a:stretch>
-                    <a:fillRect/>
-                  </a:stretch>
-                </pic:blipFill>
-                <pic:spPr>
-                  <a:xfrm>
-                    <a:off x="0" y="0"/>
-                    <a:ext cx="7900416" cy="137160"/>
-                  </a:xfrm>
-                  <a:prstGeom prst="rect"/>
-                  <a:ln/>
-                </pic:spPr>
-              </pic:pic>
-            </a:graphicData>
-          </a:graphic>
-        </wp:anchor>
-      </w:drawing>
-    </w:r>
-    <w:r>
-      <w:rPr>
-        <w:b w:val="1"/>
-        <w:color w:val="107087"/>
-        <w:sz w:val="18"/>
-        <w:szCs w:val="18"/>
         <w:rtl w:val="0"/>
       </w:rPr>
       <w:t xml:space="preserve">SOW</w:t>
@@ -5732,53 +5654,6 @@
         <w:szCs w:val="28"/>
       </w:rPr>
     </w:pPr>
-    <w:r>
-      <w:rPr>
-        <w:rtl w:val="0"/>
-      </w:rPr>
-    </w:r>
-    <w:r>
-      <w:drawing>
-        <wp:anchor allowOverlap="1" behindDoc="0" distB="114300" distT="114300" distL="114300" distR="114300" hidden="0" layoutInCell="1" locked="0" relativeHeight="0" simplePos="0">
-          <wp:simplePos x="0" y="0"/>
-          <wp:positionH relativeFrom="column">
-            <wp:posOffset>-619124</wp:posOffset>
-          </wp:positionH>
-          <wp:positionV relativeFrom="paragraph">
-            <wp:posOffset>-114299</wp:posOffset>
-          </wp:positionV>
-          <wp:extent cx="7759243" cy="1604963"/>
-          <wp:effectExtent b="0" l="0" r="0" t="0"/>
-          <wp:wrapSquare wrapText="bothSides" distB="114300" distT="114300" distL="114300" distR="114300"/>
-          <wp:docPr id="3" name="image1.png"/>
-          <a:graphic>
-            <a:graphicData uri="http://schemas.openxmlformats.org/drawingml/2006/picture">
-              <pic:pic>
-                <pic:nvPicPr>
-                  <pic:cNvPr id="0" name="image1.png"/>
-                  <pic:cNvPicPr preferRelativeResize="0"/>
-                </pic:nvPicPr>
-                <pic:blipFill>
-                  <a:blip r:embed="rId1"/>
-                  <a:srcRect b="0" l="0" r="0" t="0"/>
-                  <a:stretch>
-                    <a:fillRect/>
-                  </a:stretch>
-                </pic:blipFill>
-                <pic:spPr>
-                  <a:xfrm>
-                    <a:off x="0" y="0"/>
-                    <a:ext cx="7759243" cy="1604963"/>
-                  </a:xfrm>
-                  <a:prstGeom prst="rect"/>
-                  <a:ln/>
-                </pic:spPr>
-              </pic:pic>
-            </a:graphicData>
-          </a:graphic>
-        </wp:anchor>
-      </w:drawing>
-    </w:r>
   </w:p>
 </w:hdr>
 </file>
@@ -5806,54 +5681,6 @@
         <w:szCs w:val="18"/>
       </w:rPr>
     </w:pPr>
-    <w:r>
-      <w:rPr>
-        <w:b w:val="1"/>
-        <w:color w:val="107087"/>
-        <w:sz w:val="18"/>
-        <w:szCs w:val="18"/>
-      </w:rPr>
-      <w:drawing>
-        <wp:anchor allowOverlap="1" behindDoc="0" distB="0" distT="0" distL="0" distR="0" hidden="0" layoutInCell="1" locked="0" relativeHeight="0" simplePos="0">
-          <wp:simplePos x="0" y="0"/>
-          <wp:positionH relativeFrom="page">
-            <wp:align>left</wp:align>
-          </wp:positionH>
-          <wp:positionV relativeFrom="page">
-            <wp:align>top</wp:align>
-          </wp:positionV>
-          <wp:extent cx="7927848" cy="137160"/>
-          <wp:effectExtent b="0" l="0" r="0" t="0"/>
-          <wp:wrapSquare wrapText="bothSides" distB="0" distT="0" distL="0" distR="0"/>
-          <wp:docPr id="1" name="image2.png"/>
-          <a:graphic>
-            <a:graphicData uri="http://schemas.openxmlformats.org/drawingml/2006/picture">
-              <pic:pic>
-                <pic:nvPicPr>
-                  <pic:cNvPr id="0" name="image2.png"/>
-                  <pic:cNvPicPr preferRelativeResize="0"/>
-                </pic:nvPicPr>
-                <pic:blipFill>
-                  <a:blip r:embed="rId1"/>
-                  <a:srcRect b="46571" l="0" r="0" t="0"/>
-                  <a:stretch>
-                    <a:fillRect/>
-                  </a:stretch>
-                </pic:blipFill>
-                <pic:spPr>
-                  <a:xfrm>
-                    <a:off x="0" y="0"/>
-                    <a:ext cx="7927848" cy="137160"/>
-                  </a:xfrm>
-                  <a:prstGeom prst="rect"/>
-                  <a:ln/>
-                </pic:spPr>
-              </pic:pic>
-            </a:graphicData>
-          </a:graphic>
-        </wp:anchor>
-      </w:drawing>
-    </w:r>
     <w:r>
       <w:rPr>
         <w:b w:val="1"/>

</xml_diff>

<commit_message>
chore(templates): update contract templates and forms (#613)
Routine refresh of contract template and external-form artifacts and catalog metadata. Contributions are welcome — open an issue or pull request and we'll fold it in.

Co-authored-by: OpenAgreements <noreply@openagreements.org>
</commit_message>
<xml_diff>
--- a/templates/common-paper-cc-by-4.0/common-paper-independent-contractor-agreement/template.docx
+++ b/templates/common-paper-cc-by-4.0/common-paper-independent-contractor-agreement/template.docx
@@ -596,38 +596,6 @@
         </w:rPr>
         <w:t xml:space="preserve">Send to your counterparty for review and signature.</w:t>
       </w:r>
-      <w:r>
-        <w:rPr>
-          <w:rtl w:val="0"/>
-        </w:rPr>
-      </w:r>
-    </w:p>
-    <w:p>
-      <w:pPr>
-        <w:tabs>
-          <w:tab w:val="left" w:leader="none" w:pos="360"/>
-          <w:tab w:val="left" w:leader="none" w:pos="720"/>
-          <w:tab w:val="left" w:leader="none" w:pos="1080"/>
-          <w:tab w:val="left" w:leader="none" w:pos="1440"/>
-        </w:tabs>
-        <w:spacing w:after="120" w:lineRule="auto"/>
-        <w:rPr>
-          <w:rFonts w:ascii="Georgia" w:cs="Georgia" w:eastAsia="Georgia" w:hAnsi="Georgia"/>
-          <w:color w:val="1d2021"/>
-          <w:sz w:val="44"/>
-          <w:szCs w:val="44"/>
-        </w:rPr>
-        <w:sectPr>
-          <w:headerReference r:id="rId6" w:type="default"/>
-          <w:headerReference r:id="rId7" w:type="first"/>
-          <w:footerReference r:id="rId8" w:type="default"/>
-          <w:footerReference r:id="rId9" w:type="first"/>
-          <w:pgSz w:h="15840" w:w="12240" w:orient="portrait"/>
-          <w:pgMar w:bottom="720" w:top="936" w:left="1080" w:right="1080" w:header="360" w:footer="432"/>
-          <w:pgNumType w:start="1"/>
-          <w:titlePg w:val="1"/>
-        </w:sectPr>
-      </w:pPr>
       <w:r>
         <w:rPr>
           <w:rtl w:val="0"/>
@@ -2530,6 +2498,8 @@
           <w:color w:val="000000"/>
         </w:rPr>
         <w:sectPr>
+          <w:headerReference r:id="rId6" w:type="default"/>
+          <w:footerReference r:id="rId8" w:type="default"/>
           <w:type w:val="nextPage"/>
           <w:pgSz w:h="15840" w:w="12240" w:orient="portrait"/>
           <w:pgMar w:bottom="720" w:top="936" w:left="1080" w:right="1080" w:header="360" w:footer="432"/>
@@ -5664,54 +5634,6 @@
         <w:color w:val="107087"/>
         <w:sz w:val="18"/>
         <w:szCs w:val="18"/>
-      </w:rPr>
-      <w:drawing>
-        <wp:anchor allowOverlap="1" behindDoc="0" distB="0" distT="0" distL="0" distR="0" hidden="0" layoutInCell="1" locked="0" relativeHeight="0" simplePos="0">
-          <wp:simplePos x="0" y="0"/>
-          <wp:positionH relativeFrom="page">
-            <wp:posOffset>0</wp:posOffset>
-          </wp:positionH>
-          <wp:positionV relativeFrom="page">
-            <wp:posOffset>0</wp:posOffset>
-          </wp:positionV>
-          <wp:extent cx="7900416" cy="137160"/>
-          <wp:effectExtent b="0" l="0" r="0" t="0"/>
-          <wp:wrapSquare wrapText="bothSides" distB="0" distT="0" distL="0" distR="0"/>
-          <wp:docPr id="2" name="image2.png"/>
-          <a:graphic>
-            <a:graphicData uri="http://schemas.openxmlformats.org/drawingml/2006/picture">
-              <pic:pic>
-                <pic:nvPicPr>
-                  <pic:cNvPr id="0" name="image2.png"/>
-                  <pic:cNvPicPr preferRelativeResize="0"/>
-                </pic:nvPicPr>
-                <pic:blipFill>
-                  <a:blip r:embed="rId1"/>
-                  <a:srcRect b="46571" l="0" r="0" t="0"/>
-                  <a:stretch>
-                    <a:fillRect/>
-                  </a:stretch>
-                </pic:blipFill>
-                <pic:spPr>
-                  <a:xfrm>
-                    <a:off x="0" y="0"/>
-                    <a:ext cx="7900416" cy="137160"/>
-                  </a:xfrm>
-                  <a:prstGeom prst="rect"/>
-                  <a:ln/>
-                </pic:spPr>
-              </pic:pic>
-            </a:graphicData>
-          </a:graphic>
-        </wp:anchor>
-      </w:drawing>
-    </w:r>
-    <w:r>
-      <w:rPr>
-        <w:b w:val="1"/>
-        <w:color w:val="107087"/>
-        <w:sz w:val="18"/>
-        <w:szCs w:val="18"/>
         <w:rtl w:val="0"/>
       </w:rPr>
       <w:t xml:space="preserve">SOW</w:t>
@@ -5732,53 +5654,6 @@
         <w:szCs w:val="28"/>
       </w:rPr>
     </w:pPr>
-    <w:r>
-      <w:rPr>
-        <w:rtl w:val="0"/>
-      </w:rPr>
-    </w:r>
-    <w:r>
-      <w:drawing>
-        <wp:anchor allowOverlap="1" behindDoc="0" distB="114300" distT="114300" distL="114300" distR="114300" hidden="0" layoutInCell="1" locked="0" relativeHeight="0" simplePos="0">
-          <wp:simplePos x="0" y="0"/>
-          <wp:positionH relativeFrom="column">
-            <wp:posOffset>-619124</wp:posOffset>
-          </wp:positionH>
-          <wp:positionV relativeFrom="paragraph">
-            <wp:posOffset>-114299</wp:posOffset>
-          </wp:positionV>
-          <wp:extent cx="7759243" cy="1604963"/>
-          <wp:effectExtent b="0" l="0" r="0" t="0"/>
-          <wp:wrapSquare wrapText="bothSides" distB="114300" distT="114300" distL="114300" distR="114300"/>
-          <wp:docPr id="3" name="image1.png"/>
-          <a:graphic>
-            <a:graphicData uri="http://schemas.openxmlformats.org/drawingml/2006/picture">
-              <pic:pic>
-                <pic:nvPicPr>
-                  <pic:cNvPr id="0" name="image1.png"/>
-                  <pic:cNvPicPr preferRelativeResize="0"/>
-                </pic:nvPicPr>
-                <pic:blipFill>
-                  <a:blip r:embed="rId1"/>
-                  <a:srcRect b="0" l="0" r="0" t="0"/>
-                  <a:stretch>
-                    <a:fillRect/>
-                  </a:stretch>
-                </pic:blipFill>
-                <pic:spPr>
-                  <a:xfrm>
-                    <a:off x="0" y="0"/>
-                    <a:ext cx="7759243" cy="1604963"/>
-                  </a:xfrm>
-                  <a:prstGeom prst="rect"/>
-                  <a:ln/>
-                </pic:spPr>
-              </pic:pic>
-            </a:graphicData>
-          </a:graphic>
-        </wp:anchor>
-      </w:drawing>
-    </w:r>
   </w:p>
 </w:hdr>
 </file>
@@ -5806,54 +5681,6 @@
         <w:szCs w:val="18"/>
       </w:rPr>
     </w:pPr>
-    <w:r>
-      <w:rPr>
-        <w:b w:val="1"/>
-        <w:color w:val="107087"/>
-        <w:sz w:val="18"/>
-        <w:szCs w:val="18"/>
-      </w:rPr>
-      <w:drawing>
-        <wp:anchor allowOverlap="1" behindDoc="0" distB="0" distT="0" distL="0" distR="0" hidden="0" layoutInCell="1" locked="0" relativeHeight="0" simplePos="0">
-          <wp:simplePos x="0" y="0"/>
-          <wp:positionH relativeFrom="page">
-            <wp:align>left</wp:align>
-          </wp:positionH>
-          <wp:positionV relativeFrom="page">
-            <wp:align>top</wp:align>
-          </wp:positionV>
-          <wp:extent cx="7927848" cy="137160"/>
-          <wp:effectExtent b="0" l="0" r="0" t="0"/>
-          <wp:wrapSquare wrapText="bothSides" distB="0" distT="0" distL="0" distR="0"/>
-          <wp:docPr id="1" name="image2.png"/>
-          <a:graphic>
-            <a:graphicData uri="http://schemas.openxmlformats.org/drawingml/2006/picture">
-              <pic:pic>
-                <pic:nvPicPr>
-                  <pic:cNvPr id="0" name="image2.png"/>
-                  <pic:cNvPicPr preferRelativeResize="0"/>
-                </pic:nvPicPr>
-                <pic:blipFill>
-                  <a:blip r:embed="rId1"/>
-                  <a:srcRect b="46571" l="0" r="0" t="0"/>
-                  <a:stretch>
-                    <a:fillRect/>
-                  </a:stretch>
-                </pic:blipFill>
-                <pic:spPr>
-                  <a:xfrm>
-                    <a:off x="0" y="0"/>
-                    <a:ext cx="7927848" cy="137160"/>
-                  </a:xfrm>
-                  <a:prstGeom prst="rect"/>
-                  <a:ln/>
-                </pic:spPr>
-              </pic:pic>
-            </a:graphicData>
-          </a:graphic>
-        </wp:anchor>
-      </w:drawing>
-    </w:r>
     <w:r>
       <w:rPr>
         <w:b w:val="1"/>

</xml_diff>